<commit_message>
feat: opd reports done
</commit_message>
<xml_diff>
--- a/Основы профессиональной деятельности/ЛБ1.docx
+++ b/Основы профессиональной деятельности/ЛБ1.docx
@@ -500,7 +500,6 @@
           <w:rFonts w:ascii="Times New Roman" w:hAnsi="Times New Roman" w:cs="Times New Roman"/>
           <w:sz w:val="28"/>
           <w:szCs w:val="28"/>
-          <w:lang w:val="en-US"/>
         </w:rPr>
       </w:pPr>
       <w:r>
@@ -1240,72 +1239,26 @@
     </w:p>
     <w:p>
       <w:pPr>
-        <w:jc w:val="both"/>
-        <w:rPr>
-          <w:rFonts w:ascii="Times New Roman" w:hAnsi="Times New Roman" w:cs="Times New Roman"/>
-          <w:sz w:val="28"/>
-          <w:szCs w:val="28"/>
-        </w:rPr>
-      </w:pPr>
-      <w:r>
-        <w:rPr>
+        <w:keepNext/>
+        <w:jc w:val="center"/>
+        <w:rPr>
+          <w:rFonts w:ascii="Times New Roman" w:hAnsi="Times New Roman" w:cs="Times New Roman"/>
+          <w:sz w:val="28"/>
+          <w:szCs w:val="28"/>
+        </w:rPr>
+      </w:pPr>
+      <w:r>
+        <w:rPr>
+          <w:rFonts w:ascii="Times New Roman" w:hAnsi="Times New Roman" w:cs="Times New Roman"/>
           <w:noProof/>
+          <w:sz w:val="28"/>
+          <w:szCs w:val="28"/>
         </w:rPr>
         <w:drawing>
           <wp:inline distT="0" distB="0" distL="0" distR="0" wp14:anchorId="7BE12750" wp14:editId="4BCD039F">
             <wp:extent cx="5940425" cy="4127500"/>
             <wp:effectExtent l="0" t="0" r="0" b="0"/>
             <wp:docPr id="1" name="Рисунок 1"/>
-            <wp:cNvGraphicFramePr>
-              <a:graphicFrameLocks xmlns:a="http://schemas.openxmlformats.org/drawingml/2006/main" noChangeAspect="1"/>
-            </wp:cNvGraphicFramePr>
-            <a:graphic xmlns:a="http://schemas.openxmlformats.org/drawingml/2006/main">
-              <a:graphicData uri="http://schemas.openxmlformats.org/drawingml/2006/picture">
-                <pic:pic xmlns:pic="http://schemas.openxmlformats.org/drawingml/2006/picture">
-                  <pic:nvPicPr>
-                    <pic:cNvPr id="1" name=""/>
-                    <pic:cNvPicPr/>
-                  </pic:nvPicPr>
-                  <pic:blipFill>
-                    <a:blip r:embed="rId5"/>
-                    <a:stretch>
-                      <a:fillRect/>
-                    </a:stretch>
-                  </pic:blipFill>
-                  <pic:spPr>
-                    <a:xfrm>
-                      <a:off x="0" y="0"/>
-                      <a:ext cx="5940425" cy="4127500"/>
-                    </a:xfrm>
-                    <a:prstGeom prst="rect">
-                      <a:avLst/>
-                    </a:prstGeom>
-                  </pic:spPr>
-                </pic:pic>
-              </a:graphicData>
-            </a:graphic>
-          </wp:inline>
-        </w:drawing>
-      </w:r>
-    </w:p>
-    <w:p>
-      <w:pPr>
-        <w:jc w:val="both"/>
-        <w:rPr>
-          <w:rFonts w:ascii="Times New Roman" w:hAnsi="Times New Roman" w:cs="Times New Roman"/>
-          <w:sz w:val="28"/>
-          <w:szCs w:val="28"/>
-        </w:rPr>
-      </w:pPr>
-      <w:r>
-        <w:rPr>
-          <w:noProof/>
-        </w:rPr>
-        <w:drawing>
-          <wp:inline distT="0" distB="0" distL="0" distR="0" wp14:anchorId="418FD124" wp14:editId="27F08ACB">
-            <wp:extent cx="3743325" cy="1862442"/>
-            <wp:effectExtent l="0" t="0" r="0" b="0"/>
-            <wp:docPr id="3" name="Рисунок 3"/>
             <wp:cNvGraphicFramePr>
               <a:graphicFrameLocks xmlns:a="http://schemas.openxmlformats.org/drawingml/2006/main" noChangeAspect="1"/>
             </wp:cNvGraphicFramePr>
@@ -1325,7 +1278,7 @@
                   <pic:spPr>
                     <a:xfrm>
                       <a:off x="0" y="0"/>
-                      <a:ext cx="3759134" cy="1870308"/>
+                      <a:ext cx="5940425" cy="4127500"/>
                     </a:xfrm>
                     <a:prstGeom prst="rect">
                       <a:avLst/>
@@ -1340,525 +1293,130 @@
     </w:p>
     <w:p>
       <w:pPr>
-        <w:rPr>
-          <w:rFonts w:ascii="Times New Roman" w:hAnsi="Times New Roman" w:cs="Times New Roman"/>
-          <w:sz w:val="28"/>
-          <w:szCs w:val="28"/>
-        </w:rPr>
-      </w:pPr>
-      <w:r>
-        <w:rPr>
-          <w:rFonts w:ascii="Times New Roman" w:hAnsi="Times New Roman" w:cs="Times New Roman"/>
-          <w:sz w:val="28"/>
-          <w:szCs w:val="28"/>
-        </w:rPr>
-        <w:br w:type="page"/>
-      </w:r>
-    </w:p>
-    <w:p>
-      <w:pPr>
+        <w:pStyle w:val="aa"/>
         <w:jc w:val="center"/>
         <w:rPr>
           <w:rFonts w:ascii="Times New Roman" w:hAnsi="Times New Roman" w:cs="Times New Roman"/>
-          <w:b/>
-          <w:bCs/>
-          <w:sz w:val="28"/>
-          <w:szCs w:val="28"/>
-        </w:rPr>
-      </w:pPr>
-      <w:r>
-        <w:rPr>
-          <w:rFonts w:ascii="Times New Roman" w:hAnsi="Times New Roman" w:cs="Times New Roman"/>
-          <w:b/>
-          <w:bCs/>
-          <w:sz w:val="28"/>
-          <w:szCs w:val="28"/>
-        </w:rPr>
-        <w:lastRenderedPageBreak/>
-        <w:t>Нотация к коду</w:t>
-      </w:r>
-    </w:p>
-    <w:p>
-      <w:pPr>
-        <w:ind w:firstLine="567"/>
-        <w:jc w:val="both"/>
-        <w:rPr>
-          <w:rFonts w:ascii="Times New Roman" w:hAnsi="Times New Roman" w:cs="Times New Roman"/>
-          <w:sz w:val="28"/>
-          <w:szCs w:val="28"/>
-        </w:rPr>
-      </w:pPr>
-      <w:r>
-        <w:rPr>
-          <w:rFonts w:ascii="Times New Roman" w:hAnsi="Times New Roman" w:cs="Times New Roman"/>
-          <w:sz w:val="28"/>
-          <w:szCs w:val="28"/>
-        </w:rPr>
-        <w:t xml:space="preserve">Для файла </w:t>
-      </w:r>
-      <w:r>
-        <w:rPr>
-          <w:rFonts w:ascii="Times New Roman" w:hAnsi="Times New Roman" w:cs="Times New Roman"/>
+          <w:i w:val="0"/>
+          <w:iCs w:val="0"/>
+          <w:color w:val="auto"/>
+          <w:sz w:val="28"/>
+          <w:szCs w:val="28"/>
+        </w:rPr>
+      </w:pPr>
+      <w:r>
+        <w:rPr>
+          <w:rFonts w:ascii="Times New Roman" w:hAnsi="Times New Roman" w:cs="Times New Roman"/>
+          <w:i w:val="0"/>
+          <w:iCs w:val="0"/>
+          <w:color w:val="auto"/>
+          <w:sz w:val="28"/>
+          <w:szCs w:val="28"/>
+        </w:rPr>
+        <w:t xml:space="preserve">Рисунок </w:t>
+      </w:r>
+      <w:r>
+        <w:rPr>
+          <w:rFonts w:ascii="Times New Roman" w:hAnsi="Times New Roman" w:cs="Times New Roman"/>
+          <w:i w:val="0"/>
+          <w:iCs w:val="0"/>
+          <w:color w:val="auto"/>
+          <w:sz w:val="28"/>
+          <w:szCs w:val="28"/>
+        </w:rPr>
+        <w:fldChar w:fldCharType="begin"/>
+      </w:r>
+      <w:r>
+        <w:rPr>
+          <w:rFonts w:ascii="Times New Roman" w:hAnsi="Times New Roman" w:cs="Times New Roman"/>
+          <w:i w:val="0"/>
+          <w:iCs w:val="0"/>
+          <w:color w:val="auto"/>
+          <w:sz w:val="28"/>
+          <w:szCs w:val="28"/>
+        </w:rPr>
+        <w:instrText xml:space="preserve"> SEQ Рисунок \* ARABIC </w:instrText>
+      </w:r>
+      <w:r>
+        <w:rPr>
+          <w:rFonts w:ascii="Times New Roman" w:hAnsi="Times New Roman" w:cs="Times New Roman"/>
+          <w:i w:val="0"/>
+          <w:iCs w:val="0"/>
+          <w:color w:val="auto"/>
+          <w:sz w:val="28"/>
+          <w:szCs w:val="28"/>
+        </w:rPr>
+        <w:fldChar w:fldCharType="separate"/>
+      </w:r>
+      <w:r>
+        <w:rPr>
+          <w:rFonts w:ascii="Times New Roman" w:hAnsi="Times New Roman" w:cs="Times New Roman"/>
+          <w:i w:val="0"/>
+          <w:iCs w:val="0"/>
+          <w:noProof/>
+          <w:color w:val="auto"/>
+          <w:sz w:val="28"/>
+          <w:szCs w:val="28"/>
+        </w:rPr>
+        <w:t>1</w:t>
+      </w:r>
+      <w:r>
+        <w:rPr>
+          <w:rFonts w:ascii="Times New Roman" w:hAnsi="Times New Roman" w:cs="Times New Roman"/>
+          <w:i w:val="0"/>
+          <w:iCs w:val="0"/>
+          <w:color w:val="auto"/>
+          <w:sz w:val="28"/>
+          <w:szCs w:val="28"/>
+        </w:rPr>
+        <w:fldChar w:fldCharType="end"/>
+      </w:r>
+      <w:r>
+        <w:rPr>
+          <w:rFonts w:ascii="Times New Roman" w:hAnsi="Times New Roman" w:cs="Times New Roman"/>
+          <w:i w:val="0"/>
+          <w:iCs w:val="0"/>
+          <w:color w:val="auto"/>
+          <w:sz w:val="28"/>
+          <w:szCs w:val="28"/>
+        </w:rPr>
+        <w:t xml:space="preserve">. Код </w:t>
+      </w:r>
+      <w:r>
+        <w:rPr>
+          <w:rFonts w:ascii="Times New Roman" w:hAnsi="Times New Roman" w:cs="Times New Roman"/>
+          <w:i w:val="0"/>
+          <w:iCs w:val="0"/>
+          <w:color w:val="auto"/>
           <w:sz w:val="28"/>
           <w:szCs w:val="28"/>
           <w:lang w:val="en-US"/>
         </w:rPr>
-        <w:t>parser</w:t>
-      </w:r>
-      <w:r>
-        <w:rPr>
-          <w:rFonts w:ascii="Times New Roman" w:hAnsi="Times New Roman" w:cs="Times New Roman"/>
-          <w:sz w:val="28"/>
-          <w:szCs w:val="28"/>
-        </w:rPr>
-        <w:t>2.</w:t>
-      </w:r>
-      <w:r>
-        <w:rPr>
-          <w:rFonts w:ascii="Times New Roman" w:hAnsi="Times New Roman" w:cs="Times New Roman"/>
-          <w:sz w:val="28"/>
-          <w:szCs w:val="28"/>
-          <w:lang w:val="en-US"/>
-        </w:rPr>
-        <w:t>py</w:t>
-      </w:r>
-      <w:r>
-        <w:rPr>
-          <w:rFonts w:ascii="Times New Roman" w:hAnsi="Times New Roman" w:cs="Times New Roman"/>
-          <w:sz w:val="28"/>
-          <w:szCs w:val="28"/>
-        </w:rPr>
-        <w:t xml:space="preserve">. </w:t>
-      </w:r>
-      <w:r>
-        <w:rPr>
-          <w:rFonts w:ascii="Times New Roman" w:hAnsi="Times New Roman" w:cs="Times New Roman"/>
-          <w:sz w:val="28"/>
-          <w:szCs w:val="28"/>
-        </w:rPr>
-        <w:t xml:space="preserve">Импортируем библиотеки для парсинга; создаём функцию </w:t>
-      </w:r>
-      <w:r>
-        <w:rPr>
-          <w:rFonts w:ascii="Times New Roman" w:hAnsi="Times New Roman" w:cs="Times New Roman"/>
-          <w:sz w:val="28"/>
-          <w:szCs w:val="28"/>
-          <w:lang w:val="en-US"/>
-        </w:rPr>
-        <w:t>parser</w:t>
-      </w:r>
-      <w:r>
-        <w:rPr>
-          <w:rFonts w:ascii="Times New Roman" w:hAnsi="Times New Roman" w:cs="Times New Roman"/>
-          <w:sz w:val="28"/>
-          <w:szCs w:val="28"/>
-        </w:rPr>
-        <w:t xml:space="preserve">; определяем переменные </w:t>
-      </w:r>
-      <w:proofErr w:type="spellStart"/>
-      <w:r>
-        <w:rPr>
-          <w:rFonts w:ascii="Times New Roman" w:hAnsi="Times New Roman" w:cs="Times New Roman"/>
-          <w:sz w:val="28"/>
-          <w:szCs w:val="28"/>
-          <w:lang w:val="en-US"/>
-        </w:rPr>
-        <w:t>url</w:t>
-      </w:r>
-      <w:proofErr w:type="spellEnd"/>
-      <w:r>
-        <w:rPr>
-          <w:rFonts w:ascii="Times New Roman" w:hAnsi="Times New Roman" w:cs="Times New Roman"/>
-          <w:sz w:val="28"/>
-          <w:szCs w:val="28"/>
-        </w:rPr>
-        <w:t xml:space="preserve"> (</w:t>
-      </w:r>
-      <w:r>
-        <w:rPr>
-          <w:rFonts w:ascii="Times New Roman" w:hAnsi="Times New Roman" w:cs="Times New Roman"/>
-          <w:sz w:val="28"/>
-          <w:szCs w:val="28"/>
-        </w:rPr>
-        <w:t>сайта</w:t>
-      </w:r>
-      <w:r>
-        <w:rPr>
-          <w:rFonts w:ascii="Times New Roman" w:hAnsi="Times New Roman" w:cs="Times New Roman"/>
-          <w:sz w:val="28"/>
-          <w:szCs w:val="28"/>
-        </w:rPr>
-        <w:t xml:space="preserve">),  </w:t>
-      </w:r>
-      <w:r>
-        <w:rPr>
-          <w:rFonts w:ascii="Times New Roman" w:hAnsi="Times New Roman" w:cs="Times New Roman"/>
-          <w:sz w:val="28"/>
-          <w:szCs w:val="28"/>
-          <w:lang w:val="en-US"/>
-        </w:rPr>
-        <w:t>proxies</w:t>
-      </w:r>
-      <w:r>
-        <w:rPr>
-          <w:rFonts w:ascii="Times New Roman" w:hAnsi="Times New Roman" w:cs="Times New Roman"/>
-          <w:sz w:val="28"/>
-          <w:szCs w:val="28"/>
-        </w:rPr>
-        <w:t xml:space="preserve"> (</w:t>
-      </w:r>
-      <w:r>
-        <w:rPr>
-          <w:rFonts w:ascii="Times New Roman" w:hAnsi="Times New Roman" w:cs="Times New Roman"/>
-          <w:sz w:val="28"/>
-          <w:szCs w:val="28"/>
-        </w:rPr>
-        <w:t>для работы во внутренней сети ОмГТУ</w:t>
-      </w:r>
-      <w:r>
-        <w:rPr>
-          <w:rFonts w:ascii="Times New Roman" w:hAnsi="Times New Roman" w:cs="Times New Roman"/>
-          <w:sz w:val="28"/>
-          <w:szCs w:val="28"/>
-        </w:rPr>
-        <w:t>)</w:t>
-      </w:r>
-      <w:r>
-        <w:rPr>
-          <w:rFonts w:ascii="Times New Roman" w:hAnsi="Times New Roman" w:cs="Times New Roman"/>
-          <w:sz w:val="28"/>
-          <w:szCs w:val="28"/>
-        </w:rPr>
-        <w:t xml:space="preserve">, </w:t>
-      </w:r>
-      <w:r>
-        <w:rPr>
-          <w:rFonts w:ascii="Times New Roman" w:hAnsi="Times New Roman" w:cs="Times New Roman"/>
-          <w:sz w:val="28"/>
-          <w:szCs w:val="28"/>
-          <w:lang w:val="en-US"/>
-        </w:rPr>
-        <w:t>headers</w:t>
-      </w:r>
-      <w:r>
-        <w:rPr>
-          <w:rFonts w:ascii="Times New Roman" w:hAnsi="Times New Roman" w:cs="Times New Roman"/>
-          <w:sz w:val="28"/>
-          <w:szCs w:val="28"/>
-        </w:rPr>
-        <w:t xml:space="preserve"> (</w:t>
-      </w:r>
-      <w:r>
-        <w:rPr>
-          <w:rFonts w:ascii="Times New Roman" w:hAnsi="Times New Roman" w:cs="Times New Roman"/>
-          <w:sz w:val="28"/>
-          <w:szCs w:val="28"/>
-        </w:rPr>
-        <w:t>заголовки, чтобы сайт не думал, что мы - бот</w:t>
-      </w:r>
-      <w:r>
-        <w:rPr>
-          <w:rFonts w:ascii="Times New Roman" w:hAnsi="Times New Roman" w:cs="Times New Roman"/>
-          <w:sz w:val="28"/>
-          <w:szCs w:val="28"/>
-        </w:rPr>
-        <w:t>)</w:t>
-      </w:r>
-      <w:r>
-        <w:rPr>
-          <w:rFonts w:ascii="Times New Roman" w:hAnsi="Times New Roman" w:cs="Times New Roman"/>
-          <w:sz w:val="28"/>
-          <w:szCs w:val="28"/>
-        </w:rPr>
-        <w:t xml:space="preserve">; определяем пустой список </w:t>
-      </w:r>
-      <w:r>
-        <w:rPr>
-          <w:rFonts w:ascii="Times New Roman" w:hAnsi="Times New Roman" w:cs="Times New Roman"/>
-          <w:sz w:val="28"/>
-          <w:szCs w:val="28"/>
-          <w:lang w:val="en-US"/>
-        </w:rPr>
-        <w:t>prices</w:t>
-      </w:r>
-      <w:r>
-        <w:rPr>
-          <w:rFonts w:ascii="Times New Roman" w:hAnsi="Times New Roman" w:cs="Times New Roman"/>
-          <w:sz w:val="28"/>
-          <w:szCs w:val="28"/>
-        </w:rPr>
-        <w:t xml:space="preserve">; </w:t>
-      </w:r>
-      <w:r>
-        <w:rPr>
-          <w:rFonts w:ascii="Times New Roman" w:hAnsi="Times New Roman" w:cs="Times New Roman"/>
-          <w:sz w:val="28"/>
-          <w:szCs w:val="28"/>
-        </w:rPr>
-        <w:t xml:space="preserve">в цикле на </w:t>
-      </w:r>
-      <w:r>
-        <w:rPr>
-          <w:rFonts w:ascii="Times New Roman" w:hAnsi="Times New Roman" w:cs="Times New Roman"/>
-          <w:sz w:val="28"/>
-          <w:szCs w:val="28"/>
-        </w:rPr>
-        <w:t>4</w:t>
-      </w:r>
-      <w:r>
-        <w:rPr>
-          <w:rFonts w:ascii="Times New Roman" w:hAnsi="Times New Roman" w:cs="Times New Roman"/>
-          <w:sz w:val="28"/>
-          <w:szCs w:val="28"/>
-        </w:rPr>
-        <w:t xml:space="preserve"> итераций (количество страниц на сайте) получаем страницу с </w:t>
-      </w:r>
-      <w:r>
-        <w:rPr>
-          <w:rFonts w:ascii="Times New Roman" w:hAnsi="Times New Roman" w:cs="Times New Roman"/>
-          <w:sz w:val="28"/>
-          <w:szCs w:val="28"/>
-          <w:lang w:val="en-US"/>
-        </w:rPr>
-        <w:t>iPhone</w:t>
-      </w:r>
-      <w:r>
-        <w:rPr>
-          <w:rFonts w:ascii="Times New Roman" w:hAnsi="Times New Roman" w:cs="Times New Roman"/>
-          <w:sz w:val="28"/>
-          <w:szCs w:val="28"/>
-        </w:rPr>
-        <w:t xml:space="preserve">; загружаем её в </w:t>
-      </w:r>
-      <w:r>
-        <w:rPr>
-          <w:rFonts w:ascii="Times New Roman" w:hAnsi="Times New Roman" w:cs="Times New Roman"/>
-          <w:sz w:val="28"/>
-          <w:szCs w:val="28"/>
-          <w:lang w:val="en-US"/>
-        </w:rPr>
-        <w:t>BeautifulSoup</w:t>
-      </w:r>
-      <w:r>
-        <w:rPr>
-          <w:rFonts w:ascii="Times New Roman" w:hAnsi="Times New Roman" w:cs="Times New Roman"/>
-          <w:sz w:val="28"/>
-          <w:szCs w:val="28"/>
-        </w:rPr>
-        <w:t xml:space="preserve"> </w:t>
-      </w:r>
-      <w:r>
-        <w:rPr>
-          <w:rFonts w:ascii="Times New Roman" w:hAnsi="Times New Roman" w:cs="Times New Roman"/>
-          <w:sz w:val="28"/>
-          <w:szCs w:val="28"/>
-        </w:rPr>
-        <w:t xml:space="preserve">с использованием стандартного парсера </w:t>
-      </w:r>
-      <w:r>
-        <w:rPr>
-          <w:rFonts w:ascii="Times New Roman" w:hAnsi="Times New Roman" w:cs="Times New Roman"/>
-          <w:sz w:val="28"/>
-          <w:szCs w:val="28"/>
-          <w:lang w:val="en-US"/>
-        </w:rPr>
-        <w:t>html</w:t>
-      </w:r>
-      <w:r>
-        <w:rPr>
-          <w:rFonts w:ascii="Times New Roman" w:hAnsi="Times New Roman" w:cs="Times New Roman"/>
-          <w:sz w:val="28"/>
-          <w:szCs w:val="28"/>
-        </w:rPr>
-        <w:t>.</w:t>
-      </w:r>
-      <w:r>
-        <w:rPr>
-          <w:rFonts w:ascii="Times New Roman" w:hAnsi="Times New Roman" w:cs="Times New Roman"/>
-          <w:sz w:val="28"/>
-          <w:szCs w:val="28"/>
-          <w:lang w:val="en-US"/>
-        </w:rPr>
-        <w:t>parser</w:t>
-      </w:r>
-      <w:r>
-        <w:rPr>
-          <w:rFonts w:ascii="Times New Roman" w:hAnsi="Times New Roman" w:cs="Times New Roman"/>
-          <w:sz w:val="28"/>
-          <w:szCs w:val="28"/>
-        </w:rPr>
-        <w:t>; находим все элементы с указанным тегом и классом (цены телефонов); затем в цикле проходимся по всем найденным элементам, удаляем пробелы, переносы на новую строку</w:t>
-      </w:r>
-      <w:r>
-        <w:rPr>
-          <w:rFonts w:ascii="Times New Roman" w:hAnsi="Times New Roman" w:cs="Times New Roman"/>
-          <w:sz w:val="28"/>
-          <w:szCs w:val="28"/>
-        </w:rPr>
-        <w:t>, запятые и знаки рубля</w:t>
-      </w:r>
-      <w:r>
-        <w:rPr>
-          <w:rFonts w:ascii="Times New Roman" w:hAnsi="Times New Roman" w:cs="Times New Roman"/>
-          <w:sz w:val="28"/>
-          <w:szCs w:val="28"/>
-        </w:rPr>
-        <w:t xml:space="preserve"> и, преобразовав в целочисленный формат, добавляем в наш список </w:t>
-      </w:r>
-      <w:r>
-        <w:rPr>
-          <w:rFonts w:ascii="Times New Roman" w:hAnsi="Times New Roman" w:cs="Times New Roman"/>
-          <w:sz w:val="28"/>
-          <w:szCs w:val="28"/>
-          <w:lang w:val="en-US"/>
-        </w:rPr>
-        <w:t>prices</w:t>
-      </w:r>
-      <w:r>
-        <w:rPr>
-          <w:rFonts w:ascii="Times New Roman" w:hAnsi="Times New Roman" w:cs="Times New Roman"/>
-          <w:sz w:val="28"/>
-          <w:szCs w:val="28"/>
-        </w:rPr>
-        <w:t>;</w:t>
-      </w:r>
-      <w:r>
-        <w:rPr>
-          <w:rFonts w:ascii="Times New Roman" w:hAnsi="Times New Roman" w:cs="Times New Roman"/>
-          <w:sz w:val="28"/>
-          <w:szCs w:val="28"/>
-        </w:rPr>
-        <w:t xml:space="preserve"> </w:t>
-      </w:r>
-      <w:r>
-        <w:rPr>
-          <w:rFonts w:ascii="Times New Roman" w:hAnsi="Times New Roman" w:cs="Times New Roman"/>
-          <w:sz w:val="28"/>
-          <w:szCs w:val="28"/>
-        </w:rPr>
-        <w:t>затем в самом конце подсчитываем и выводим минимальной, максимальное и среднее.</w:t>
-      </w:r>
-    </w:p>
-    <w:p>
-      <w:pPr>
-        <w:ind w:firstLine="567"/>
-        <w:jc w:val="both"/>
-        <w:rPr>
-          <w:rFonts w:ascii="Times New Roman" w:hAnsi="Times New Roman" w:cs="Times New Roman"/>
-          <w:sz w:val="28"/>
-          <w:szCs w:val="28"/>
-        </w:rPr>
-      </w:pPr>
-      <w:r>
-        <w:rPr>
-          <w:rFonts w:ascii="Times New Roman" w:hAnsi="Times New Roman" w:cs="Times New Roman"/>
-          <w:sz w:val="28"/>
-          <w:szCs w:val="28"/>
-        </w:rPr>
-        <w:t xml:space="preserve">В файл </w:t>
-      </w:r>
-      <w:r>
-        <w:rPr>
-          <w:rFonts w:ascii="Times New Roman" w:hAnsi="Times New Roman" w:cs="Times New Roman"/>
-          <w:sz w:val="28"/>
-          <w:szCs w:val="28"/>
-          <w:lang w:val="en-US"/>
-        </w:rPr>
-        <w:t>main</w:t>
-      </w:r>
-      <w:r>
-        <w:rPr>
-          <w:rFonts w:ascii="Times New Roman" w:hAnsi="Times New Roman" w:cs="Times New Roman"/>
-          <w:sz w:val="28"/>
-          <w:szCs w:val="28"/>
-        </w:rPr>
-        <w:t>.</w:t>
-      </w:r>
-      <w:r>
-        <w:rPr>
-          <w:rFonts w:ascii="Times New Roman" w:hAnsi="Times New Roman" w:cs="Times New Roman"/>
-          <w:sz w:val="28"/>
-          <w:szCs w:val="28"/>
-          <w:lang w:val="en-US"/>
-        </w:rPr>
-        <w:t>py</w:t>
-      </w:r>
-      <w:r>
-        <w:rPr>
-          <w:rFonts w:ascii="Times New Roman" w:hAnsi="Times New Roman" w:cs="Times New Roman"/>
-          <w:sz w:val="28"/>
-          <w:szCs w:val="28"/>
-        </w:rPr>
-        <w:t xml:space="preserve"> </w:t>
-      </w:r>
-      <w:r>
-        <w:rPr>
-          <w:rFonts w:ascii="Times New Roman" w:hAnsi="Times New Roman" w:cs="Times New Roman"/>
-          <w:sz w:val="28"/>
-          <w:szCs w:val="28"/>
-        </w:rPr>
-        <w:t>импортируем нашу функцию парсера и вызываем её (при запуске файла).</w:t>
-      </w:r>
-    </w:p>
-    <w:p>
-      <w:pPr>
-        <w:rPr>
-          <w:rFonts w:ascii="Times New Roman" w:hAnsi="Times New Roman" w:cs="Times New Roman"/>
-          <w:sz w:val="28"/>
-          <w:szCs w:val="28"/>
-        </w:rPr>
-      </w:pPr>
-      <w:r>
-        <w:rPr>
-          <w:rFonts w:ascii="Times New Roman" w:hAnsi="Times New Roman" w:cs="Times New Roman"/>
-          <w:sz w:val="28"/>
-          <w:szCs w:val="28"/>
-        </w:rPr>
-        <w:br w:type="page"/>
-      </w:r>
-    </w:p>
-    <w:p>
-      <w:pPr>
+        <w:t>parser2.py</w:t>
+      </w:r>
+    </w:p>
+    <w:p>
+      <w:pPr>
+        <w:keepNext/>
         <w:jc w:val="center"/>
         <w:rPr>
           <w:rFonts w:ascii="Times New Roman" w:hAnsi="Times New Roman" w:cs="Times New Roman"/>
-          <w:b/>
-          <w:bCs/>
-          <w:sz w:val="28"/>
-          <w:szCs w:val="28"/>
-        </w:rPr>
-      </w:pPr>
-      <w:r>
-        <w:rPr>
-          <w:rFonts w:ascii="Times New Roman" w:hAnsi="Times New Roman" w:cs="Times New Roman"/>
-          <w:b/>
-          <w:bCs/>
-          <w:sz w:val="28"/>
-          <w:szCs w:val="28"/>
-        </w:rPr>
-        <w:lastRenderedPageBreak/>
-        <w:t>Результат работы</w:t>
-      </w:r>
-    </w:p>
-    <w:p>
-      <w:pPr>
-        <w:jc w:val="both"/>
-        <w:rPr>
-          <w:rFonts w:ascii="Times New Roman" w:hAnsi="Times New Roman" w:cs="Times New Roman"/>
-          <w:sz w:val="28"/>
-          <w:szCs w:val="28"/>
-          <w:lang w:val="en-US"/>
-        </w:rPr>
-      </w:pPr>
-      <w:r>
-        <w:rPr>
+          <w:sz w:val="28"/>
+          <w:szCs w:val="28"/>
+        </w:rPr>
+      </w:pPr>
+      <w:r>
+        <w:rPr>
+          <w:rFonts w:ascii="Times New Roman" w:hAnsi="Times New Roman" w:cs="Times New Roman"/>
           <w:noProof/>
+          <w:sz w:val="28"/>
+          <w:szCs w:val="28"/>
         </w:rPr>
         <w:drawing>
-          <wp:inline distT="0" distB="0" distL="0" distR="0" wp14:anchorId="1F112911" wp14:editId="5434330C">
-            <wp:extent cx="5940425" cy="801370"/>
+          <wp:inline distT="0" distB="0" distL="0" distR="0" wp14:anchorId="418FD124" wp14:editId="27F08ACB">
+            <wp:extent cx="3743325" cy="1862442"/>
             <wp:effectExtent l="0" t="0" r="0" b="0"/>
-            <wp:docPr id="4" name="Рисунок 4"/>
+            <wp:docPr id="3" name="Рисунок 3"/>
             <wp:cNvGraphicFramePr>
               <a:graphicFrameLocks xmlns:a="http://schemas.openxmlformats.org/drawingml/2006/main" noChangeAspect="1"/>
             </wp:cNvGraphicFramePr>
@@ -1878,6 +1436,677 @@
                   <pic:spPr>
                     <a:xfrm>
                       <a:off x="0" y="0"/>
+                      <a:ext cx="3759134" cy="1870308"/>
+                    </a:xfrm>
+                    <a:prstGeom prst="rect">
+                      <a:avLst/>
+                    </a:prstGeom>
+                  </pic:spPr>
+                </pic:pic>
+              </a:graphicData>
+            </a:graphic>
+          </wp:inline>
+        </w:drawing>
+      </w:r>
+    </w:p>
+    <w:p>
+      <w:pPr>
+        <w:pStyle w:val="aa"/>
+        <w:jc w:val="center"/>
+        <w:rPr>
+          <w:rFonts w:ascii="Times New Roman" w:hAnsi="Times New Roman" w:cs="Times New Roman"/>
+          <w:i w:val="0"/>
+          <w:iCs w:val="0"/>
+          <w:color w:val="auto"/>
+          <w:sz w:val="28"/>
+          <w:szCs w:val="28"/>
+        </w:rPr>
+      </w:pPr>
+      <w:r>
+        <w:rPr>
+          <w:rFonts w:ascii="Times New Roman" w:hAnsi="Times New Roman" w:cs="Times New Roman"/>
+          <w:i w:val="0"/>
+          <w:iCs w:val="0"/>
+          <w:color w:val="auto"/>
+          <w:sz w:val="28"/>
+          <w:szCs w:val="28"/>
+        </w:rPr>
+        <w:t xml:space="preserve">Рисунок </w:t>
+      </w:r>
+      <w:r>
+        <w:rPr>
+          <w:rFonts w:ascii="Times New Roman" w:hAnsi="Times New Roman" w:cs="Times New Roman"/>
+          <w:i w:val="0"/>
+          <w:iCs w:val="0"/>
+          <w:color w:val="auto"/>
+          <w:sz w:val="28"/>
+          <w:szCs w:val="28"/>
+        </w:rPr>
+        <w:fldChar w:fldCharType="begin"/>
+      </w:r>
+      <w:r>
+        <w:rPr>
+          <w:rFonts w:ascii="Times New Roman" w:hAnsi="Times New Roman" w:cs="Times New Roman"/>
+          <w:i w:val="0"/>
+          <w:iCs w:val="0"/>
+          <w:color w:val="auto"/>
+          <w:sz w:val="28"/>
+          <w:szCs w:val="28"/>
+        </w:rPr>
+        <w:instrText xml:space="preserve"> SEQ Рисунок \* ARABIC </w:instrText>
+      </w:r>
+      <w:r>
+        <w:rPr>
+          <w:rFonts w:ascii="Times New Roman" w:hAnsi="Times New Roman" w:cs="Times New Roman"/>
+          <w:i w:val="0"/>
+          <w:iCs w:val="0"/>
+          <w:color w:val="auto"/>
+          <w:sz w:val="28"/>
+          <w:szCs w:val="28"/>
+        </w:rPr>
+        <w:fldChar w:fldCharType="separate"/>
+      </w:r>
+      <w:r>
+        <w:rPr>
+          <w:rFonts w:ascii="Times New Roman" w:hAnsi="Times New Roman" w:cs="Times New Roman"/>
+          <w:i w:val="0"/>
+          <w:iCs w:val="0"/>
+          <w:noProof/>
+          <w:color w:val="auto"/>
+          <w:sz w:val="28"/>
+          <w:szCs w:val="28"/>
+        </w:rPr>
+        <w:t>2</w:t>
+      </w:r>
+      <w:r>
+        <w:rPr>
+          <w:rFonts w:ascii="Times New Roman" w:hAnsi="Times New Roman" w:cs="Times New Roman"/>
+          <w:i w:val="0"/>
+          <w:iCs w:val="0"/>
+          <w:color w:val="auto"/>
+          <w:sz w:val="28"/>
+          <w:szCs w:val="28"/>
+        </w:rPr>
+        <w:fldChar w:fldCharType="end"/>
+      </w:r>
+      <w:r>
+        <w:rPr>
+          <w:rFonts w:ascii="Times New Roman" w:hAnsi="Times New Roman" w:cs="Times New Roman"/>
+          <w:i w:val="0"/>
+          <w:iCs w:val="0"/>
+          <w:color w:val="auto"/>
+          <w:sz w:val="28"/>
+          <w:szCs w:val="28"/>
+        </w:rPr>
+        <w:t xml:space="preserve">. Код </w:t>
+      </w:r>
+      <w:r>
+        <w:rPr>
+          <w:rFonts w:ascii="Times New Roman" w:hAnsi="Times New Roman" w:cs="Times New Roman"/>
+          <w:i w:val="0"/>
+          <w:iCs w:val="0"/>
+          <w:color w:val="auto"/>
+          <w:sz w:val="28"/>
+          <w:szCs w:val="28"/>
+          <w:lang w:val="en-US"/>
+        </w:rPr>
+        <w:t>main</w:t>
+      </w:r>
+      <w:r>
+        <w:rPr>
+          <w:rFonts w:ascii="Times New Roman" w:hAnsi="Times New Roman" w:cs="Times New Roman"/>
+          <w:i w:val="0"/>
+          <w:iCs w:val="0"/>
+          <w:color w:val="auto"/>
+          <w:sz w:val="28"/>
+          <w:szCs w:val="28"/>
+        </w:rPr>
+        <w:t>.py</w:t>
+      </w:r>
+    </w:p>
+    <w:p>
+      <w:pPr>
+        <w:rPr>
+          <w:rFonts w:ascii="Times New Roman" w:hAnsi="Times New Roman" w:cs="Times New Roman"/>
+          <w:sz w:val="28"/>
+          <w:szCs w:val="28"/>
+        </w:rPr>
+      </w:pPr>
+      <w:r>
+        <w:rPr>
+          <w:rFonts w:ascii="Times New Roman" w:hAnsi="Times New Roman" w:cs="Times New Roman"/>
+          <w:sz w:val="28"/>
+          <w:szCs w:val="28"/>
+        </w:rPr>
+        <w:br w:type="page"/>
+      </w:r>
+    </w:p>
+    <w:p>
+      <w:pPr>
+        <w:jc w:val="center"/>
+        <w:rPr>
+          <w:rFonts w:ascii="Times New Roman" w:hAnsi="Times New Roman" w:cs="Times New Roman"/>
+          <w:b/>
+          <w:bCs/>
+          <w:sz w:val="28"/>
+          <w:szCs w:val="28"/>
+        </w:rPr>
+      </w:pPr>
+      <w:r>
+        <w:rPr>
+          <w:rFonts w:ascii="Times New Roman" w:hAnsi="Times New Roman" w:cs="Times New Roman"/>
+          <w:b/>
+          <w:bCs/>
+          <w:sz w:val="28"/>
+          <w:szCs w:val="28"/>
+        </w:rPr>
+        <w:lastRenderedPageBreak/>
+        <w:t>Нотация к коду</w:t>
+      </w:r>
+    </w:p>
+    <w:p>
+      <w:pPr>
+        <w:ind w:firstLine="567"/>
+        <w:jc w:val="both"/>
+        <w:rPr>
+          <w:rFonts w:ascii="Times New Roman" w:hAnsi="Times New Roman" w:cs="Times New Roman"/>
+          <w:sz w:val="28"/>
+          <w:szCs w:val="28"/>
+        </w:rPr>
+      </w:pPr>
+      <w:r>
+        <w:rPr>
+          <w:rFonts w:ascii="Times New Roman" w:hAnsi="Times New Roman" w:cs="Times New Roman"/>
+          <w:sz w:val="28"/>
+          <w:szCs w:val="28"/>
+        </w:rPr>
+        <w:t xml:space="preserve">Для файла </w:t>
+      </w:r>
+      <w:r>
+        <w:rPr>
+          <w:rFonts w:ascii="Times New Roman" w:hAnsi="Times New Roman" w:cs="Times New Roman"/>
+          <w:sz w:val="28"/>
+          <w:szCs w:val="28"/>
+          <w:lang w:val="en-US"/>
+        </w:rPr>
+        <w:t>parser</w:t>
+      </w:r>
+      <w:r>
+        <w:rPr>
+          <w:rFonts w:ascii="Times New Roman" w:hAnsi="Times New Roman" w:cs="Times New Roman"/>
+          <w:sz w:val="28"/>
+          <w:szCs w:val="28"/>
+        </w:rPr>
+        <w:t>2.</w:t>
+      </w:r>
+      <w:r>
+        <w:rPr>
+          <w:rFonts w:ascii="Times New Roman" w:hAnsi="Times New Roman" w:cs="Times New Roman"/>
+          <w:sz w:val="28"/>
+          <w:szCs w:val="28"/>
+          <w:lang w:val="en-US"/>
+        </w:rPr>
+        <w:t>py</w:t>
+      </w:r>
+      <w:r>
+        <w:rPr>
+          <w:rFonts w:ascii="Times New Roman" w:hAnsi="Times New Roman" w:cs="Times New Roman"/>
+          <w:sz w:val="28"/>
+          <w:szCs w:val="28"/>
+        </w:rPr>
+        <w:t xml:space="preserve">. </w:t>
+      </w:r>
+      <w:r>
+        <w:rPr>
+          <w:rFonts w:ascii="Times New Roman" w:hAnsi="Times New Roman" w:cs="Times New Roman"/>
+          <w:sz w:val="28"/>
+          <w:szCs w:val="28"/>
+        </w:rPr>
+        <w:t xml:space="preserve">Импортируем библиотеки для парсинга; создаём функцию </w:t>
+      </w:r>
+      <w:r>
+        <w:rPr>
+          <w:rFonts w:ascii="Times New Roman" w:hAnsi="Times New Roman" w:cs="Times New Roman"/>
+          <w:sz w:val="28"/>
+          <w:szCs w:val="28"/>
+          <w:lang w:val="en-US"/>
+        </w:rPr>
+        <w:t>parser</w:t>
+      </w:r>
+      <w:r>
+        <w:rPr>
+          <w:rFonts w:ascii="Times New Roman" w:hAnsi="Times New Roman" w:cs="Times New Roman"/>
+          <w:sz w:val="28"/>
+          <w:szCs w:val="28"/>
+        </w:rPr>
+        <w:t xml:space="preserve">; определяем переменные </w:t>
+      </w:r>
+      <w:proofErr w:type="spellStart"/>
+      <w:r>
+        <w:rPr>
+          <w:rFonts w:ascii="Times New Roman" w:hAnsi="Times New Roman" w:cs="Times New Roman"/>
+          <w:sz w:val="28"/>
+          <w:szCs w:val="28"/>
+          <w:lang w:val="en-US"/>
+        </w:rPr>
+        <w:t>url</w:t>
+      </w:r>
+      <w:proofErr w:type="spellEnd"/>
+      <w:r>
+        <w:rPr>
+          <w:rFonts w:ascii="Times New Roman" w:hAnsi="Times New Roman" w:cs="Times New Roman"/>
+          <w:sz w:val="28"/>
+          <w:szCs w:val="28"/>
+        </w:rPr>
+        <w:t xml:space="preserve"> (</w:t>
+      </w:r>
+      <w:r>
+        <w:rPr>
+          <w:rFonts w:ascii="Times New Roman" w:hAnsi="Times New Roman" w:cs="Times New Roman"/>
+          <w:sz w:val="28"/>
+          <w:szCs w:val="28"/>
+        </w:rPr>
+        <w:t>сайта</w:t>
+      </w:r>
+      <w:r>
+        <w:rPr>
+          <w:rFonts w:ascii="Times New Roman" w:hAnsi="Times New Roman" w:cs="Times New Roman"/>
+          <w:sz w:val="28"/>
+          <w:szCs w:val="28"/>
+        </w:rPr>
+        <w:t xml:space="preserve">),  </w:t>
+      </w:r>
+      <w:r>
+        <w:rPr>
+          <w:rFonts w:ascii="Times New Roman" w:hAnsi="Times New Roman" w:cs="Times New Roman"/>
+          <w:sz w:val="28"/>
+          <w:szCs w:val="28"/>
+          <w:lang w:val="en-US"/>
+        </w:rPr>
+        <w:t>proxies</w:t>
+      </w:r>
+      <w:r>
+        <w:rPr>
+          <w:rFonts w:ascii="Times New Roman" w:hAnsi="Times New Roman" w:cs="Times New Roman"/>
+          <w:sz w:val="28"/>
+          <w:szCs w:val="28"/>
+        </w:rPr>
+        <w:t xml:space="preserve"> (</w:t>
+      </w:r>
+      <w:r>
+        <w:rPr>
+          <w:rFonts w:ascii="Times New Roman" w:hAnsi="Times New Roman" w:cs="Times New Roman"/>
+          <w:sz w:val="28"/>
+          <w:szCs w:val="28"/>
+        </w:rPr>
+        <w:t>для работы во внутренней сети ОмГТУ</w:t>
+      </w:r>
+      <w:r>
+        <w:rPr>
+          <w:rFonts w:ascii="Times New Roman" w:hAnsi="Times New Roman" w:cs="Times New Roman"/>
+          <w:sz w:val="28"/>
+          <w:szCs w:val="28"/>
+        </w:rPr>
+        <w:t>)</w:t>
+      </w:r>
+      <w:r>
+        <w:rPr>
+          <w:rFonts w:ascii="Times New Roman" w:hAnsi="Times New Roman" w:cs="Times New Roman"/>
+          <w:sz w:val="28"/>
+          <w:szCs w:val="28"/>
+        </w:rPr>
+        <w:t xml:space="preserve">, </w:t>
+      </w:r>
+      <w:r>
+        <w:rPr>
+          <w:rFonts w:ascii="Times New Roman" w:hAnsi="Times New Roman" w:cs="Times New Roman"/>
+          <w:sz w:val="28"/>
+          <w:szCs w:val="28"/>
+          <w:lang w:val="en-US"/>
+        </w:rPr>
+        <w:t>headers</w:t>
+      </w:r>
+      <w:r>
+        <w:rPr>
+          <w:rFonts w:ascii="Times New Roman" w:hAnsi="Times New Roman" w:cs="Times New Roman"/>
+          <w:sz w:val="28"/>
+          <w:szCs w:val="28"/>
+        </w:rPr>
+        <w:t xml:space="preserve"> (</w:t>
+      </w:r>
+      <w:r>
+        <w:rPr>
+          <w:rFonts w:ascii="Times New Roman" w:hAnsi="Times New Roman" w:cs="Times New Roman"/>
+          <w:sz w:val="28"/>
+          <w:szCs w:val="28"/>
+        </w:rPr>
+        <w:t>заголовки, чтобы сайт не думал, что мы - бот</w:t>
+      </w:r>
+      <w:r>
+        <w:rPr>
+          <w:rFonts w:ascii="Times New Roman" w:hAnsi="Times New Roman" w:cs="Times New Roman"/>
+          <w:sz w:val="28"/>
+          <w:szCs w:val="28"/>
+        </w:rPr>
+        <w:t>)</w:t>
+      </w:r>
+      <w:r>
+        <w:rPr>
+          <w:rFonts w:ascii="Times New Roman" w:hAnsi="Times New Roman" w:cs="Times New Roman"/>
+          <w:sz w:val="28"/>
+          <w:szCs w:val="28"/>
+        </w:rPr>
+        <w:t xml:space="preserve">; определяем пустой список </w:t>
+      </w:r>
+      <w:r>
+        <w:rPr>
+          <w:rFonts w:ascii="Times New Roman" w:hAnsi="Times New Roman" w:cs="Times New Roman"/>
+          <w:sz w:val="28"/>
+          <w:szCs w:val="28"/>
+          <w:lang w:val="en-US"/>
+        </w:rPr>
+        <w:t>prices</w:t>
+      </w:r>
+      <w:r>
+        <w:rPr>
+          <w:rFonts w:ascii="Times New Roman" w:hAnsi="Times New Roman" w:cs="Times New Roman"/>
+          <w:sz w:val="28"/>
+          <w:szCs w:val="28"/>
+        </w:rPr>
+        <w:t xml:space="preserve">; </w:t>
+      </w:r>
+      <w:r>
+        <w:rPr>
+          <w:rFonts w:ascii="Times New Roman" w:hAnsi="Times New Roman" w:cs="Times New Roman"/>
+          <w:sz w:val="28"/>
+          <w:szCs w:val="28"/>
+        </w:rPr>
+        <w:t xml:space="preserve">в цикле на </w:t>
+      </w:r>
+      <w:r>
+        <w:rPr>
+          <w:rFonts w:ascii="Times New Roman" w:hAnsi="Times New Roman" w:cs="Times New Roman"/>
+          <w:sz w:val="28"/>
+          <w:szCs w:val="28"/>
+        </w:rPr>
+        <w:t>4</w:t>
+      </w:r>
+      <w:r>
+        <w:rPr>
+          <w:rFonts w:ascii="Times New Roman" w:hAnsi="Times New Roman" w:cs="Times New Roman"/>
+          <w:sz w:val="28"/>
+          <w:szCs w:val="28"/>
+        </w:rPr>
+        <w:t xml:space="preserve"> итераций (количество страниц на сайте) получаем страницу с </w:t>
+      </w:r>
+      <w:r>
+        <w:rPr>
+          <w:rFonts w:ascii="Times New Roman" w:hAnsi="Times New Roman" w:cs="Times New Roman"/>
+          <w:sz w:val="28"/>
+          <w:szCs w:val="28"/>
+          <w:lang w:val="en-US"/>
+        </w:rPr>
+        <w:t>iPhone</w:t>
+      </w:r>
+      <w:r>
+        <w:rPr>
+          <w:rFonts w:ascii="Times New Roman" w:hAnsi="Times New Roman" w:cs="Times New Roman"/>
+          <w:sz w:val="28"/>
+          <w:szCs w:val="28"/>
+        </w:rPr>
+        <w:t xml:space="preserve">; загружаем её в </w:t>
+      </w:r>
+      <w:r>
+        <w:rPr>
+          <w:rFonts w:ascii="Times New Roman" w:hAnsi="Times New Roman" w:cs="Times New Roman"/>
+          <w:sz w:val="28"/>
+          <w:szCs w:val="28"/>
+          <w:lang w:val="en-US"/>
+        </w:rPr>
+        <w:t>BeautifulSoup</w:t>
+      </w:r>
+      <w:r>
+        <w:rPr>
+          <w:rFonts w:ascii="Times New Roman" w:hAnsi="Times New Roman" w:cs="Times New Roman"/>
+          <w:sz w:val="28"/>
+          <w:szCs w:val="28"/>
+        </w:rPr>
+        <w:t xml:space="preserve"> </w:t>
+      </w:r>
+      <w:r>
+        <w:rPr>
+          <w:rFonts w:ascii="Times New Roman" w:hAnsi="Times New Roman" w:cs="Times New Roman"/>
+          <w:sz w:val="28"/>
+          <w:szCs w:val="28"/>
+        </w:rPr>
+        <w:t xml:space="preserve">с использованием стандартного парсера </w:t>
+      </w:r>
+      <w:r>
+        <w:rPr>
+          <w:rFonts w:ascii="Times New Roman" w:hAnsi="Times New Roman" w:cs="Times New Roman"/>
+          <w:sz w:val="28"/>
+          <w:szCs w:val="28"/>
+          <w:lang w:val="en-US"/>
+        </w:rPr>
+        <w:t>html</w:t>
+      </w:r>
+      <w:r>
+        <w:rPr>
+          <w:rFonts w:ascii="Times New Roman" w:hAnsi="Times New Roman" w:cs="Times New Roman"/>
+          <w:sz w:val="28"/>
+          <w:szCs w:val="28"/>
+        </w:rPr>
+        <w:t>.</w:t>
+      </w:r>
+      <w:r>
+        <w:rPr>
+          <w:rFonts w:ascii="Times New Roman" w:hAnsi="Times New Roman" w:cs="Times New Roman"/>
+          <w:sz w:val="28"/>
+          <w:szCs w:val="28"/>
+          <w:lang w:val="en-US"/>
+        </w:rPr>
+        <w:t>parser</w:t>
+      </w:r>
+      <w:r>
+        <w:rPr>
+          <w:rFonts w:ascii="Times New Roman" w:hAnsi="Times New Roman" w:cs="Times New Roman"/>
+          <w:sz w:val="28"/>
+          <w:szCs w:val="28"/>
+        </w:rPr>
+        <w:t>; находим все элементы с указанным тегом и классом (цены телефонов); затем в цикле проходимся по всем найденным элементам, удаляем пробелы, переносы на новую строку</w:t>
+      </w:r>
+      <w:r>
+        <w:rPr>
+          <w:rFonts w:ascii="Times New Roman" w:hAnsi="Times New Roman" w:cs="Times New Roman"/>
+          <w:sz w:val="28"/>
+          <w:szCs w:val="28"/>
+        </w:rPr>
+        <w:t>, запятые и знаки рубля</w:t>
+      </w:r>
+      <w:r>
+        <w:rPr>
+          <w:rFonts w:ascii="Times New Roman" w:hAnsi="Times New Roman" w:cs="Times New Roman"/>
+          <w:sz w:val="28"/>
+          <w:szCs w:val="28"/>
+        </w:rPr>
+        <w:t xml:space="preserve"> и, преобразовав в целочисленный формат, добавляем в наш список </w:t>
+      </w:r>
+      <w:r>
+        <w:rPr>
+          <w:rFonts w:ascii="Times New Roman" w:hAnsi="Times New Roman" w:cs="Times New Roman"/>
+          <w:sz w:val="28"/>
+          <w:szCs w:val="28"/>
+          <w:lang w:val="en-US"/>
+        </w:rPr>
+        <w:t>prices</w:t>
+      </w:r>
+      <w:r>
+        <w:rPr>
+          <w:rFonts w:ascii="Times New Roman" w:hAnsi="Times New Roman" w:cs="Times New Roman"/>
+          <w:sz w:val="28"/>
+          <w:szCs w:val="28"/>
+        </w:rPr>
+        <w:t>;</w:t>
+      </w:r>
+      <w:r>
+        <w:rPr>
+          <w:rFonts w:ascii="Times New Roman" w:hAnsi="Times New Roman" w:cs="Times New Roman"/>
+          <w:sz w:val="28"/>
+          <w:szCs w:val="28"/>
+        </w:rPr>
+        <w:t xml:space="preserve"> </w:t>
+      </w:r>
+      <w:r>
+        <w:rPr>
+          <w:rFonts w:ascii="Times New Roman" w:hAnsi="Times New Roman" w:cs="Times New Roman"/>
+          <w:sz w:val="28"/>
+          <w:szCs w:val="28"/>
+        </w:rPr>
+        <w:t>затем в самом конце подсчитываем и выводим минимальной, максимальное и среднее.</w:t>
+      </w:r>
+    </w:p>
+    <w:p>
+      <w:pPr>
+        <w:ind w:firstLine="567"/>
+        <w:jc w:val="both"/>
+        <w:rPr>
+          <w:rFonts w:ascii="Times New Roman" w:hAnsi="Times New Roman" w:cs="Times New Roman"/>
+          <w:sz w:val="28"/>
+          <w:szCs w:val="28"/>
+        </w:rPr>
+      </w:pPr>
+      <w:r>
+        <w:rPr>
+          <w:rFonts w:ascii="Times New Roman" w:hAnsi="Times New Roman" w:cs="Times New Roman"/>
+          <w:sz w:val="28"/>
+          <w:szCs w:val="28"/>
+        </w:rPr>
+        <w:t xml:space="preserve">В файл </w:t>
+      </w:r>
+      <w:r>
+        <w:rPr>
+          <w:rFonts w:ascii="Times New Roman" w:hAnsi="Times New Roman" w:cs="Times New Roman"/>
+          <w:sz w:val="28"/>
+          <w:szCs w:val="28"/>
+          <w:lang w:val="en-US"/>
+        </w:rPr>
+        <w:t>main</w:t>
+      </w:r>
+      <w:r>
+        <w:rPr>
+          <w:rFonts w:ascii="Times New Roman" w:hAnsi="Times New Roman" w:cs="Times New Roman"/>
+          <w:sz w:val="28"/>
+          <w:szCs w:val="28"/>
+        </w:rPr>
+        <w:t>.</w:t>
+      </w:r>
+      <w:r>
+        <w:rPr>
+          <w:rFonts w:ascii="Times New Roman" w:hAnsi="Times New Roman" w:cs="Times New Roman"/>
+          <w:sz w:val="28"/>
+          <w:szCs w:val="28"/>
+          <w:lang w:val="en-US"/>
+        </w:rPr>
+        <w:t>py</w:t>
+      </w:r>
+      <w:r>
+        <w:rPr>
+          <w:rFonts w:ascii="Times New Roman" w:hAnsi="Times New Roman" w:cs="Times New Roman"/>
+          <w:sz w:val="28"/>
+          <w:szCs w:val="28"/>
+        </w:rPr>
+        <w:t xml:space="preserve"> </w:t>
+      </w:r>
+      <w:r>
+        <w:rPr>
+          <w:rFonts w:ascii="Times New Roman" w:hAnsi="Times New Roman" w:cs="Times New Roman"/>
+          <w:sz w:val="28"/>
+          <w:szCs w:val="28"/>
+        </w:rPr>
+        <w:t>импортируем нашу функцию парсера и вызываем её (при запуске файла).</w:t>
+      </w:r>
+    </w:p>
+    <w:p>
+      <w:pPr>
+        <w:rPr>
+          <w:rFonts w:ascii="Times New Roman" w:hAnsi="Times New Roman" w:cs="Times New Roman"/>
+          <w:sz w:val="28"/>
+          <w:szCs w:val="28"/>
+        </w:rPr>
+      </w:pPr>
+      <w:r>
+        <w:rPr>
+          <w:rFonts w:ascii="Times New Roman" w:hAnsi="Times New Roman" w:cs="Times New Roman"/>
+          <w:sz w:val="28"/>
+          <w:szCs w:val="28"/>
+        </w:rPr>
+        <w:br w:type="page"/>
+      </w:r>
+    </w:p>
+    <w:p>
+      <w:pPr>
+        <w:jc w:val="center"/>
+        <w:rPr>
+          <w:rFonts w:ascii="Times New Roman" w:hAnsi="Times New Roman" w:cs="Times New Roman"/>
+          <w:b/>
+          <w:bCs/>
+          <w:sz w:val="28"/>
+          <w:szCs w:val="28"/>
+        </w:rPr>
+      </w:pPr>
+      <w:r>
+        <w:rPr>
+          <w:rFonts w:ascii="Times New Roman" w:hAnsi="Times New Roman" w:cs="Times New Roman"/>
+          <w:b/>
+          <w:bCs/>
+          <w:sz w:val="28"/>
+          <w:szCs w:val="28"/>
+        </w:rPr>
+        <w:lastRenderedPageBreak/>
+        <w:t>Результат работы</w:t>
+      </w:r>
+    </w:p>
+    <w:p>
+      <w:pPr>
+        <w:keepNext/>
+        <w:jc w:val="center"/>
+        <w:rPr>
+          <w:rFonts w:ascii="Times New Roman" w:hAnsi="Times New Roman" w:cs="Times New Roman"/>
+          <w:sz w:val="28"/>
+          <w:szCs w:val="28"/>
+        </w:rPr>
+      </w:pPr>
+      <w:r>
+        <w:rPr>
+          <w:rFonts w:ascii="Times New Roman" w:hAnsi="Times New Roman" w:cs="Times New Roman"/>
+          <w:noProof/>
+          <w:sz w:val="28"/>
+          <w:szCs w:val="28"/>
+        </w:rPr>
+        <w:drawing>
+          <wp:inline distT="0" distB="0" distL="0" distR="0" wp14:anchorId="1F112911" wp14:editId="5434330C">
+            <wp:extent cx="5940425" cy="801370"/>
+            <wp:effectExtent l="0" t="0" r="0" b="0"/>
+            <wp:docPr id="4" name="Рисунок 4"/>
+            <wp:cNvGraphicFramePr>
+              <a:graphicFrameLocks xmlns:a="http://schemas.openxmlformats.org/drawingml/2006/main" noChangeAspect="1"/>
+            </wp:cNvGraphicFramePr>
+            <a:graphic xmlns:a="http://schemas.openxmlformats.org/drawingml/2006/main">
+              <a:graphicData uri="http://schemas.openxmlformats.org/drawingml/2006/picture">
+                <pic:pic xmlns:pic="http://schemas.openxmlformats.org/drawingml/2006/picture">
+                  <pic:nvPicPr>
+                    <pic:cNvPr id="1" name=""/>
+                    <pic:cNvPicPr/>
+                  </pic:nvPicPr>
+                  <pic:blipFill>
+                    <a:blip r:embed="rId8"/>
+                    <a:stretch>
+                      <a:fillRect/>
+                    </a:stretch>
+                  </pic:blipFill>
+                  <pic:spPr>
+                    <a:xfrm>
+                      <a:off x="0" y="0"/>
                       <a:ext cx="5940425" cy="801370"/>
                     </a:xfrm>
                     <a:prstGeom prst="rect">
@@ -1893,6 +2122,111 @@
     </w:p>
     <w:p>
       <w:pPr>
+        <w:pStyle w:val="aa"/>
+        <w:jc w:val="center"/>
+        <w:rPr>
+          <w:rFonts w:ascii="Times New Roman" w:hAnsi="Times New Roman" w:cs="Times New Roman"/>
+          <w:i w:val="0"/>
+          <w:iCs w:val="0"/>
+          <w:color w:val="auto"/>
+          <w:sz w:val="28"/>
+          <w:szCs w:val="28"/>
+          <w:lang w:val="en-US"/>
+        </w:rPr>
+      </w:pPr>
+      <w:r>
+        <w:rPr>
+          <w:rFonts w:ascii="Times New Roman" w:hAnsi="Times New Roman" w:cs="Times New Roman"/>
+          <w:i w:val="0"/>
+          <w:iCs w:val="0"/>
+          <w:color w:val="auto"/>
+          <w:sz w:val="28"/>
+          <w:szCs w:val="28"/>
+        </w:rPr>
+        <w:t xml:space="preserve">Рисунок </w:t>
+      </w:r>
+      <w:r>
+        <w:rPr>
+          <w:rFonts w:ascii="Times New Roman" w:hAnsi="Times New Roman" w:cs="Times New Roman"/>
+          <w:i w:val="0"/>
+          <w:iCs w:val="0"/>
+          <w:color w:val="auto"/>
+          <w:sz w:val="28"/>
+          <w:szCs w:val="28"/>
+        </w:rPr>
+        <w:fldChar w:fldCharType="begin"/>
+      </w:r>
+      <w:r>
+        <w:rPr>
+          <w:rFonts w:ascii="Times New Roman" w:hAnsi="Times New Roman" w:cs="Times New Roman"/>
+          <w:i w:val="0"/>
+          <w:iCs w:val="0"/>
+          <w:color w:val="auto"/>
+          <w:sz w:val="28"/>
+          <w:szCs w:val="28"/>
+        </w:rPr>
+        <w:instrText xml:space="preserve"> SEQ Рисунок \* ARABIC </w:instrText>
+      </w:r>
+      <w:r>
+        <w:rPr>
+          <w:rFonts w:ascii="Times New Roman" w:hAnsi="Times New Roman" w:cs="Times New Roman"/>
+          <w:i w:val="0"/>
+          <w:iCs w:val="0"/>
+          <w:color w:val="auto"/>
+          <w:sz w:val="28"/>
+          <w:szCs w:val="28"/>
+        </w:rPr>
+        <w:fldChar w:fldCharType="separate"/>
+      </w:r>
+      <w:r>
+        <w:rPr>
+          <w:rFonts w:ascii="Times New Roman" w:hAnsi="Times New Roman" w:cs="Times New Roman"/>
+          <w:i w:val="0"/>
+          <w:iCs w:val="0"/>
+          <w:noProof/>
+          <w:color w:val="auto"/>
+          <w:sz w:val="28"/>
+          <w:szCs w:val="28"/>
+        </w:rPr>
+        <w:t>3</w:t>
+      </w:r>
+      <w:r>
+        <w:rPr>
+          <w:rFonts w:ascii="Times New Roman" w:hAnsi="Times New Roman" w:cs="Times New Roman"/>
+          <w:i w:val="0"/>
+          <w:iCs w:val="0"/>
+          <w:color w:val="auto"/>
+          <w:sz w:val="28"/>
+          <w:szCs w:val="28"/>
+        </w:rPr>
+        <w:fldChar w:fldCharType="end"/>
+      </w:r>
+      <w:r>
+        <w:rPr>
+          <w:rFonts w:ascii="Times New Roman" w:hAnsi="Times New Roman" w:cs="Times New Roman"/>
+          <w:i w:val="0"/>
+          <w:iCs w:val="0"/>
+          <w:color w:val="auto"/>
+          <w:sz w:val="28"/>
+          <w:szCs w:val="28"/>
+          <w:lang w:val="en-US"/>
+        </w:rPr>
+        <w:t xml:space="preserve">. </w:t>
+      </w:r>
+      <w:r>
+        <w:rPr>
+          <w:rFonts w:ascii="Times New Roman" w:hAnsi="Times New Roman" w:cs="Times New Roman"/>
+          <w:i w:val="0"/>
+          <w:iCs w:val="0"/>
+          <w:color w:val="auto"/>
+          <w:sz w:val="28"/>
+          <w:szCs w:val="28"/>
+        </w:rPr>
+        <w:t>Результат работы</w:t>
+      </w:r>
+    </w:p>
+    <w:p>
+      <w:pPr>
         <w:jc w:val="center"/>
         <w:rPr>
           <w:rFonts w:ascii="Times New Roman" w:hAnsi="Times New Roman" w:cs="Times New Roman"/>
@@ -1907,7 +2241,6 @@
           <w:rFonts w:ascii="Times New Roman" w:hAnsi="Times New Roman" w:cs="Times New Roman"/>
           <w:sz w:val="28"/>
           <w:szCs w:val="28"/>
-          <w:lang w:val="en-US"/>
         </w:rPr>
         <w:br w:type="page"/>
       </w:r>
@@ -1960,7 +2293,7 @@
         </w:rPr>
         <w:t xml:space="preserve">Ссылка на репозиторий: </w:t>
       </w:r>
-      <w:hyperlink r:id="rId8" w:history="1">
+      <w:hyperlink r:id="rId9" w:history="1">
         <w:proofErr w:type="spellStart"/>
         <w:r>
           <w:rPr>
@@ -2640,6 +2973,7 @@
   <w:style w:type="character" w:default="1" w:styleId="a0">
     <w:name w:val="Default Paragraph Font"/>
     <w:uiPriority w:val="1"/>
+    <w:semiHidden/>
     <w:unhideWhenUsed/>
   </w:style>
   <w:style w:type="table" w:default="1" w:styleId="a1">
@@ -2779,6 +3113,25 @@
     <w:rPr>
       <w:color w:val="605E5C"/>
       <w:shd w:val="clear" w:color="auto" w:fill="E1DFDD"/>
+    </w:rPr>
+  </w:style>
+  <w:style w:type="paragraph" w:styleId="aa">
+    <w:name w:val="caption"/>
+    <w:basedOn w:val="a"/>
+    <w:next w:val="a"/>
+    <w:uiPriority w:val="35"/>
+    <w:unhideWhenUsed/>
+    <w:qFormat/>
+    <w:rsid w:val="00410F13"/>
+    <w:pPr>
+      <w:spacing w:line="240" w:lineRule="auto"/>
+    </w:pPr>
+    <w:rPr>
+      <w:i/>
+      <w:iCs/>
+      <w:color w:val="1F497D" w:themeColor="text2"/>
+      <w:sz w:val="18"/>
+      <w:szCs w:val="18"/>
     </w:rPr>
   </w:style>
 </w:styles>
@@ -3065,4 +3418,16 @@
   <a:objectDefaults/>
   <a:extraClrSchemeLst/>
 </a:theme>
+</file>
+
+<file path=customXml/item1.xml><?xml version="1.0" encoding="utf-8"?>
+<b:Sources xmlns:b="http://schemas.openxmlformats.org/officeDocument/2006/bibliography" xmlns="http://schemas.openxmlformats.org/officeDocument/2006/bibliography" SelectedStyle="\APASixthEditionOfficeOnline.xsl" StyleName="APA" Version="6"/>
+</file>
+
+<file path=customXml/itemProps1.xml><?xml version="1.0" encoding="utf-8"?>
+<ds:datastoreItem xmlns:ds="http://schemas.openxmlformats.org/officeDocument/2006/customXml" ds:itemID="{15F7A400-7E46-4B54-84D0-1DD3D50B27CA}">
+  <ds:schemaRefs>
+    <ds:schemaRef ds:uri="http://schemas.openxmlformats.org/officeDocument/2006/bibliography"/>
+  </ds:schemaRefs>
+</ds:datastoreItem>
 </file>
</xml_diff>